<commit_message>
Update daily stock monitor reports
</commit_message>
<xml_diff>
--- a/data/BOLL/美股BOLL布林线监控报告-2026-08-26.docx
+++ b/data/BOLL/美股BOLL布林线监控报告-2026-08-26.docx
@@ -15,7 +15,7 @@
         <w:pStyle w:val="ListBullet"/>
       </w:pPr>
       <w:r>
-        <w:t>生成时间（美东）：2026-08-26 21:36:10 EDT</w:t>
+        <w:t>生成时间（美东）：2026-08-27 00:09:45 EDT</w:t>
       </w:r>
     </w:p>
     <w:p>
@@ -32,6 +32,14 @@
       </w:pPr>
       <w:r>
         <w:t>数据源优先级：Yahoo Chart API -&gt; yfinance（可选备用，无需额外配置）</w:t>
+      </w:r>
+    </w:p>
+    <w:p>
+      <w:pPr>
+        <w:pStyle w:val="ListBullet"/>
+      </w:pPr>
+      <w:r>
+        <w:t>提醒：当前美东交易日尚未收盘，本次使用最近可用交易日的收盘数据计算。</w:t>
       </w:r>
     </w:p>
     <w:p>
@@ -336,7 +344,7 @@
           </w:tcPr>
           <w:p>
             <w:r>
-              <w:t>1.82</w:t>
+              <w:t>1.83</w:t>
             </w:r>
           </w:p>
         </w:tc>
@@ -612,7 +620,7 @@
           </w:tcPr>
           <w:p>
             <w:r>
-              <w:t>0.83</w:t>
+              <w:t>0.86</w:t>
             </w:r>
           </w:p>
         </w:tc>
@@ -796,7 +804,7 @@
           </w:tcPr>
           <w:p>
             <w:r>
-              <w:t>0.68</w:t>
+              <w:t>0.69</w:t>
             </w:r>
           </w:p>
         </w:tc>
@@ -888,7 +896,7 @@
           </w:tcPr>
           <w:p>
             <w:r>
-              <w:t>0.65</w:t>
+              <w:t>0.66</w:t>
             </w:r>
           </w:p>
         </w:tc>
@@ -980,7 +988,7 @@
           </w:tcPr>
           <w:p>
             <w:r>
-              <w:t>0.58</w:t>
+              <w:t>0.59</w:t>
             </w:r>
           </w:p>
         </w:tc>
@@ -1072,7 +1080,7 @@
           </w:tcPr>
           <w:p>
             <w:r>
-              <w:t>0.51</w:t>
+              <w:t>0.54</w:t>
             </w:r>
           </w:p>
         </w:tc>
@@ -1164,7 +1172,7 @@
           </w:tcPr>
           <w:p>
             <w:r>
-              <w:t>0.46</w:t>
+              <w:t>0.47</w:t>
             </w:r>
           </w:p>
         </w:tc>
@@ -1216,7 +1224,7 @@
           </w:tcPr>
           <w:p>
             <w:r>
-              <w:t>强收口：Bandwidth创近100日新低；中轨附近窄幅震荡；低位形态</w:t>
+              <w:t>弱收口：Bandwidth低于近8个月30%分位且最近8个交易日及以上连续下降，并已连续16天维持低分位；中轨附近窄幅震荡；低位形态</w:t>
             </w:r>
           </w:p>
         </w:tc>
@@ -1236,7 +1244,7 @@
           </w:tcPr>
           <w:p>
             <w:r>
-              <w:t>42.81%</w:t>
+              <w:t>51.29%</w:t>
             </w:r>
           </w:p>
         </w:tc>
@@ -1246,7 +1254,7 @@
           </w:tcPr>
           <w:p>
             <w:r>
-              <w:t>0.464</w:t>
+              <w:t>0.442</w:t>
             </w:r>
           </w:p>
         </w:tc>
@@ -1256,7 +1264,7 @@
           </w:tcPr>
           <w:p>
             <w:r>
-              <w:t>0.14</w:t>
+              <w:t>0.34</w:t>
             </w:r>
           </w:p>
         </w:tc>
@@ -1373,7 +1381,7 @@
         <w:pStyle w:val="ListBullet"/>
       </w:pPr>
       <w:r>
-        <w:t>成交量：当日 7690448；20日均量 3137187；量比 2.45</w:t>
+        <w:t>成交量：当日 7690600；20日均量 3137195；量比 2.45</w:t>
       </w:r>
     </w:p>
     <w:p>
@@ -1453,7 +1461,7 @@
         <w:pStyle w:val="ListBullet"/>
       </w:pPr>
       <w:r>
-        <w:t>成交量：当日 18231940；20日均量 9999862；量比 1.82</w:t>
+        <w:t>成交量：当日 18338300；20日均量 10005180；量比 1.83</w:t>
       </w:r>
     </w:p>
     <w:p>
@@ -1533,7 +1541,7 @@
         <w:pStyle w:val="ListBullet"/>
       </w:pPr>
       <w:r>
-        <w:t>成交量：当日 51432002；20日均量 34129240；量比 1.51</w:t>
+        <w:t>成交量：当日 51710700；20日均量 34143175；量比 1.51</w:t>
       </w:r>
     </w:p>
     <w:p>
@@ -1613,7 +1621,7 @@
         <w:pStyle w:val="ListBullet"/>
       </w:pPr>
       <w:r>
-        <w:t>成交量：当日 10419287；20日均量 10462169；量比 1.00</w:t>
+        <w:t>成交量：当日 10466300；20日均量 10464520；量比 1.00</w:t>
       </w:r>
     </w:p>
     <w:p>
@@ -1693,7 +1701,7 @@
         <w:pStyle w:val="ListBullet"/>
       </w:pPr>
       <w:r>
-        <w:t>成交量：当日 37445517；20日均量 45074261；量比 0.83</w:t>
+        <w:t>成交量：当日 38783900；20日均量 45141180；量比 0.86</w:t>
       </w:r>
     </w:p>
     <w:p>
@@ -1773,7 +1781,7 @@
         <w:pStyle w:val="ListBullet"/>
       </w:pPr>
       <w:r>
-        <w:t>成交量：当日 4680697；20日均量 5672745；量比 0.83</w:t>
+        <w:t>成交量：当日 4712200；20日均量 5674320；量比 0.83</w:t>
       </w:r>
     </w:p>
     <w:p>
@@ -1853,7 +1861,7 @@
         <w:pStyle w:val="ListBullet"/>
       </w:pPr>
       <w:r>
-        <w:t>成交量：当日 18073128；20日均量 26482716；量比 0.68</w:t>
+        <w:t>成交量：当日 18290000；20日均量 26493560；量比 0.69</w:t>
       </w:r>
     </w:p>
     <w:p>
@@ -1933,7 +1941,7 @@
         <w:pStyle w:val="ListBullet"/>
       </w:pPr>
       <w:r>
-        <w:t>成交量：当日 12810919；20日均量 19734556；量比 0.65</w:t>
+        <w:t>成交量：当日 12974500；20日均量 19742735；量比 0.66</w:t>
       </w:r>
     </w:p>
     <w:p>
@@ -2013,7 +2021,7 @@
         <w:pStyle w:val="ListBullet"/>
       </w:pPr>
       <w:r>
-        <w:t>成交量：当日 13804691；20日均量 23996965；量比 0.58</w:t>
+        <w:t>成交量：当日 14193300；20日均量 24016395；量比 0.59</w:t>
       </w:r>
     </w:p>
     <w:p>
@@ -2093,7 +2101,7 @@
         <w:pStyle w:val="ListBullet"/>
       </w:pPr>
       <w:r>
-        <w:t>成交量：当日 17071668；20日均量 33617078；量比 0.51</w:t>
+        <w:t>成交量：当日 18333700；20日均量 33680180；量比 0.54</w:t>
       </w:r>
     </w:p>
     <w:p>
@@ -2173,7 +2181,7 @@
         <w:pStyle w:val="ListBullet"/>
       </w:pPr>
       <w:r>
-        <w:t>成交量：当日 5454042；20日均量 11785002；量比 0.46</w:t>
+        <w:t>成交量：当日 5553800；20日均量 11789990；量比 0.47</w:t>
       </w:r>
     </w:p>
     <w:p>
@@ -2229,7 +2237,7 @@
         <w:pStyle w:val="ListBullet"/>
       </w:pPr>
       <w:r>
-        <w:t>最新收盘价：$3.84</w:t>
+        <w:t>最新收盘价：$3.73</w:t>
       </w:r>
     </w:p>
     <w:p>
@@ -2237,7 +2245,7 @@
         <w:pStyle w:val="ListBullet"/>
       </w:pPr>
       <w:r>
-        <w:t>BOLL：上轨 $4.74；中轨 $3.90；下轨 $3.07</w:t>
+        <w:t>BOLL：上轨 $4.83；中轨 $3.84；下轨 $2.86</w:t>
       </w:r>
     </w:p>
     <w:p>
@@ -2245,7 +2253,7 @@
         <w:pStyle w:val="ListBullet"/>
       </w:pPr>
       <w:r>
-        <w:t>Bandwidth：42.81%；历史分位：1.12%；%B：0.464</w:t>
+        <w:t>Bandwidth：51.29%；历史分位：5.68%；%B：0.442</w:t>
       </w:r>
     </w:p>
     <w:p>
@@ -2253,7 +2261,7 @@
         <w:pStyle w:val="ListBullet"/>
       </w:pPr>
       <w:r>
-        <w:t>成交量：当日 273708；20日均量 1939613；量比 0.14</w:t>
+        <w:t>成交量：当日 706954；20日均量 2103242；量比 0.34</w:t>
       </w:r>
     </w:p>
     <w:p>
@@ -2261,7 +2269,7 @@
         <w:pStyle w:val="ListBullet"/>
       </w:pPr>
       <w:r>
-        <w:t>触发信号：强收口：Bandwidth创近100日新低；中轨附近窄幅震荡；低位形态</w:t>
+        <w:t>触发信号：弱收口：Bandwidth低于近8个月30%分位且最近8个交易日及以上连续下降，并已连续16天维持低分位；中轨附近窄幅震荡；低位形态</w:t>
       </w:r>
     </w:p>
     <w:p>

</xml_diff>